<commit_message>
fix(legal): update letterhead with official registration address and PrivatBank IBAN, generate v4 documents
</commit_message>
<xml_diff>
--- a/_DROPZONE/OUT/01_IREX_Grant_Proposal_NovyShlyakh_FULL_v3.docx
+++ b/_DROPZONE/OUT/01_IREX_Grant_Proposal_NovyShlyakh_FULL_v3.docx
@@ -24,7 +24,7 @@
         <w:rPr>
           <w:sz w:val="16"/>
         </w:rPr>
-        <w:t>ЄДРПОУ: 45119390 | р/р UA893052990000026001050211999 у АТ СЕНС БАНК, МФО 305299</w:t>
+        <w:t>ЄДРПОУ: 45119390 | р/р UA49305299000002600103160858113 у АТ КБ «ПРИВАТБАНК», МФО 305299</w:t>
       </w:r>
     </w:p>
     <w:p>
@@ -36,7 +36,7 @@
         <w:rPr>
           <w:sz w:val="16"/>
         </w:rPr>
-        <w:t>Юридична адреса: м. Черкаси, вул. Смілянська, 44, оф. 212 | Тел: +38 (063) 656-89-99 | ngo.talan.ua@gmail.com</w:t>
+        <w:t>Юридична адреса: 18005, м. Черкаси, вул. Волкова, буд. 95, кв. 26 | Тел: +38 (063) 656-89-99 | ngo.talan.ua@gmail.com</w:t>
       </w:r>
     </w:p>
     <w:p>

</xml_diff>